<commit_message>
Update agreement generation logic and documentation
Replit-Commit-Author: Agent
</commit_message>
<xml_diff>
--- a/docs/Patient-Pipeline-Lawyer-Brief.docx
+++ b/docs/Patient-Pipeline-Lawyer-Brief.docx
@@ -39,7 +39,7 @@
         <w:pStyle w:val="Normal"/>
       </w:pPr>
       <w:r>
-        <w:t xml:space="preserve">Please prepare a business-to-business software subscription agreement for Patient Pipeline, purchased by healthcare practices for use by their own staff. Deliver an editable Word master and a final PDF, with a reusable order form for customer-specific commercial terms.</w:t>
+        <w:t xml:space="preserve">Please draft a NEW business-to-business software subscription agreement for Patient Pipeline, owned and operated by Beyond Healthcare LLC and purchased by healthcare practices for use by their own staff. This brief is not a proposed contract and does not ask you merely to approve the app's existing template. Deliver an editable Word master and a final PDF, with a reusable order form for customer-specific commercial terms.</w:t>
       </w:r>
     </w:p>
     <w:p>
@@ -135,6 +135,342 @@
         <w:pStyle w:val="Heading1"/>
       </w:pPr>
       <w:r>
+        <w:t xml:space="preserve">Feature list: Patient Reactivation</w:t>
+      </w:r>
+    </w:p>
+    <w:p>
+      <w:pPr>
+        <w:pStyle w:val="Normal"/>
+      </w:pPr>
+      <w:r>
+        <w:t xml:space="preserve">Synopsis: a practice's staff work through past/inactive patient contacts using guided, service-specific conversations and a shared follow-up worklist. This is staff-workflow software, not a service that supplies callers or guarantees patients will return.</w:t>
+      </w:r>
+    </w:p>
+    <w:p>
+      <w:pPr>
+        <w:pStyle w:val="Normal"/>
+      </w:pPr>
+      <w:r>
+        <w:t xml:space="preserve">- Add individual contacts and import CSV patient/contact lists, with field mapping, validation, and duplicate handling.</w:t>
+      </w:r>
+    </w:p>
+    <w:p>
+      <w:pPr>
+        <w:pStyle w:val="Normal"/>
+      </w:pPr>
+      <w:r>
+        <w:t xml:space="preserve">- Organize contacts by service/niche and track their contact details, pipeline stage, notes, and call history.</w:t>
+      </w:r>
+    </w:p>
+    <w:p>
+      <w:pPr>
+        <w:pStyle w:val="Normal"/>
+      </w:pPr>
+      <w:r>
+        <w:t xml:space="preserve">- Build calling batches and see contacts due for follow-up.</w:t>
+      </w:r>
+    </w:p>
+    <w:p>
+      <w:pPr>
+        <w:pStyle w:val="Normal"/>
+      </w:pPr>
+      <w:r>
+        <w:t xml:space="preserve">- Open guided, branching scripts with contact/practice context and service-specific questions and objection handling.</w:t>
+      </w:r>
+    </w:p>
+    <w:p>
+      <w:pPr>
+        <w:pStyle w:val="Normal"/>
+      </w:pPr>
+      <w:r>
+        <w:t xml:space="preserve">- Record staff-selected outcomes, appointments and follow-up details; maintain a history of outreach.</w:t>
+      </w:r>
+    </w:p>
+    <w:p>
+      <w:pPr>
+        <w:pStyle w:val="Normal"/>
+      </w:pPr>
+      <w:r>
+        <w:t xml:space="preserve">- Schedule subsequent staff follow-up and manage the practice's shared worklist.</w:t>
+      </w:r>
+    </w:p>
+    <w:p>
+      <w:pPr>
+        <w:pStyle w:val="Normal"/>
+      </w:pPr>
+      <w:r>
+        <w:t xml:space="preserve">- Practice scripts in a training/practice environment and access video training courses.</w:t>
+      </w:r>
+    </w:p>
+    <w:p>
+      <w:pPr>
+        <w:pStyle w:val="Normal"/>
+      </w:pPr>
+      <w:r>
+        <w:t xml:space="preserve">- Review recorded calling activity and outcome reports by caller and service/niche.</w:t>
+      </w:r>
+    </w:p>
+    <w:p>
+      <w:pPr>
+        <w:pStyle w:val="Normal"/>
+      </w:pPr>
+      <w:r>
+        <w:t xml:space="preserve">The UI may use the word "dialer," but that does not establish an automatic phone dialer or integrated telephony. The workflow guides staff calls; the contract should not promise automatic calling.</w:t>
+      </w:r>
+    </w:p>
+    <w:p>
+      <w:pPr>
+        <w:pStyle w:val="Heading1"/>
+      </w:pPr>
+      <w:r>
+        <w:t xml:space="preserve">Feature list: Lead Follow-Up</w:t>
+      </w:r>
+    </w:p>
+    <w:p>
+      <w:pPr>
+        <w:pStyle w:val="Normal"/>
+      </w:pPr>
+      <w:r>
+        <w:t xml:space="preserve">Synopsis: a practice organizes incoming campaign inquiries and gives staff offer-specific scripts, due-call queues, and follow-up/appointment workflows, so inquiries do not depend on an individual's memory.</w:t>
+      </w:r>
+    </w:p>
+    <w:p>
+      <w:pPr>
+        <w:pStyle w:val="Normal"/>
+      </w:pPr>
+      <w:r>
+        <w:t xml:space="preserve">- Create and manage campaigns, including the service/niche, offer, and associated lead-follow-up script.</w:t>
+      </w:r>
+    </w:p>
+    <w:p>
+      <w:pPr>
+        <w:pStyle w:val="Normal"/>
+      </w:pPr>
+      <w:r>
+        <w:t xml:space="preserve">- Add/import leads and accept structured inbound lead submissions through campaign-specific connection/webhook endpoints.</w:t>
+      </w:r>
+    </w:p>
+    <w:p>
+      <w:pPr>
+        <w:pStyle w:val="Normal"/>
+      </w:pPr>
+      <w:r>
+        <w:t xml:space="preserve">- Provide connection instructions for GoHighLevel forms/workflows and Facebook/Instagram Instant Form leads routed through GoHighLevel or a connector such as Zapier/Make.</w:t>
+      </w:r>
+    </w:p>
+    <w:p>
+      <w:pPr>
+        <w:pStyle w:val="Normal"/>
+      </w:pPr>
+      <w:r>
+        <w:t xml:space="preserve">- Show shared queues for Ready to Call, In Progress, Calls Upcoming, and All Leads, with prior activity and next due times.</w:t>
+      </w:r>
+    </w:p>
+    <w:p>
+      <w:pPr>
+        <w:pStyle w:val="Normal"/>
+      </w:pPr>
+      <w:r>
+        <w:t xml:space="preserve">- Guide staff through branching, campaign/offer-specific conversations and objection handling.</w:t>
+      </w:r>
+    </w:p>
+    <w:p>
+      <w:pPr>
+        <w:pStyle w:val="Normal"/>
+      </w:pPr>
+      <w:r>
+        <w:t xml:space="preserve">- Log calls and outcomes; schedule retries, requested callbacks, and longer-term follow-up.</w:t>
+      </w:r>
+    </w:p>
+    <w:p>
+      <w:pPr>
+        <w:pStyle w:val="Normal"/>
+      </w:pPr>
+      <w:r>
+        <w:t xml:space="preserve">- Support appointment-intent, booking-outcome, and confirmation/reschedule workflows using recorded information. Do not promise universal two-way synchronization with an external scheduling/EHR system.</w:t>
+      </w:r>
+    </w:p>
+    <w:p>
+      <w:pPr>
+        <w:pStyle w:val="Normal"/>
+      </w:pPr>
+      <w:r>
+        <w:t xml:space="preserve">- Provide practice mode and lead-follow-up training.</w:t>
+      </w:r>
+    </w:p>
+    <w:p>
+      <w:pPr>
+        <w:pStyle w:val="Normal"/>
+      </w:pPr>
+      <w:r>
+        <w:t xml:space="preserve">- Report lead activity, booking outcomes and caller performance; keep confirmation work distinct from new-booking results.</w:t>
+      </w:r>
+    </w:p>
+    <w:p>
+      <w:pPr>
+        <w:pStyle w:val="Normal"/>
+      </w:pPr>
+      <w:r>
+        <w:t xml:space="preserve">Automatic queue scheduling is not automatic calling. Logged bookings and outcomes are not independent proof of attendance, clinical results, or collected revenue. External connectors require customer setup and may have separate service fees.</w:t>
+      </w:r>
+    </w:p>
+    <w:p>
+      <w:pPr>
+        <w:pStyle w:val="Heading1"/>
+      </w:pPr>
+      <w:r>
+        <w:t xml:space="preserve">Shared portal and account features</w:t>
+      </w:r>
+    </w:p>
+    <w:p>
+      <w:pPr>
+        <w:pStyle w:val="Normal"/>
+      </w:pPr>
+      <w:r>
+        <w:t xml:space="preserve">- Separate owner/staff access and administrator management, with product access and staff-seat controls.</w:t>
+      </w:r>
+    </w:p>
+    <w:p>
+      <w:pPr>
+        <w:pStyle w:val="Normal"/>
+      </w:pPr>
+      <w:r>
+        <w:t xml:space="preserve">- Customer billing views, payment-card management, payment history, remaining-payment information, and end-of-term/billing-period cancellation scheduling.</w:t>
+      </w:r>
+    </w:p>
+    <w:p>
+      <w:pPr>
+        <w:pStyle w:val="Normal"/>
+      </w:pPr>
+      <w:r>
+        <w:t xml:space="preserve">- Administrative customer/payment-link management, agreement preparation/signing records, subscription management, refunds, and payment-retry tools.</w:t>
+      </w:r>
+    </w:p>
+    <w:p>
+      <w:pPr>
+        <w:pStyle w:val="Normal"/>
+      </w:pPr>
+      <w:r>
+        <w:t xml:space="preserve">- Electronic signatures, section initials, versioned agreement text, signed snapshots, completion certificates, and signed-copy PDFs.</w:t>
+      </w:r>
+    </w:p>
+    <w:p>
+      <w:pPr>
+        <w:pStyle w:val="Normal"/>
+      </w:pPr>
+      <w:r>
+        <w:t xml:space="preserve">- Private video training access, course organization, and training/activity reporting.</w:t>
+      </w:r>
+    </w:p>
+    <w:p>
+      <w:pPr>
+        <w:pStyle w:val="Normal"/>
+      </w:pPr>
+      <w:r>
+        <w:t xml:space="preserve">Features above describe implemented software surfaces; purchased access, permissions and configuration can vary. They are not uptime, security-certification, integration-compatibility, or performance guarantees. No independent end-to-end audit of every feature was conducted for this brief.</w:t>
+      </w:r>
+    </w:p>
+    <w:p>
+      <w:pPr>
+        <w:pStyle w:val="Heading1"/>
+      </w:pPr>
+      <w:r>
+        <w:t xml:space="preserve">Technology stack and third-party services</w:t>
+      </w:r>
+    </w:p>
+    <w:p>
+      <w:pPr>
+        <w:pStyle w:val="Normal"/>
+      </w:pPr>
+      <w:r>
+        <w:t xml:space="preserve">- Frontend: React 19 with TypeScript, Vite, Wouter routing, Tailwind CSS, Base UI/Radix UI component primitives, React Hook Form, Zod validation, Recharts reporting charts, and Framer Motion.</w:t>
+      </w:r>
+    </w:p>
+    <w:p>
+      <w:pPr>
+        <w:pStyle w:val="Normal"/>
+      </w:pPr>
+      <w:r>
+        <w:t xml:space="preserve">- Backend: Node.js with TypeScript and Express 5; shared types/API schemas, Zod validation, Pino logging, and application-specific RPC/REST/webhook endpoints.</w:t>
+      </w:r>
+    </w:p>
+    <w:p>
+      <w:pPr>
+        <w:pStyle w:val="Normal"/>
+      </w:pPr>
+      <w:r>
+        <w:t xml:space="preserve">- Data/authentication: Supabase authentication and PostgreSQL, accessed through the Supabase JavaScript client and Drizzle ORM. The application uses its existing Supabase database; do not describe it as migrated to a Replit-managed database.</w:t>
+      </w:r>
+    </w:p>
+    <w:p>
+      <w:pPr>
+        <w:pStyle w:val="Normal"/>
+      </w:pPr>
+      <w:r>
+        <w:t xml:space="preserve">- Payments: Stripe subscriptions, payment methods and checkout components, with server-side payment processing and webhook handling.</w:t>
+      </w:r>
+    </w:p>
+    <w:p>
+      <w:pPr>
+        <w:pStyle w:val="Normal"/>
+      </w:pPr>
+      <w:r>
+        <w:t xml:space="preserve">- Email: Resend for transactional application email. GoHighLevel is separately used for website sales inquiries/appointments and relevant configured lead-intake connections.</w:t>
+      </w:r>
+    </w:p>
+    <w:p>
+      <w:pPr>
+        <w:pStyle w:val="Normal"/>
+      </w:pPr>
+      <w:r>
+        <w:t xml:space="preserve">- Media/files: Vercel Blob for existing protected training-media storage/streaming; fixed public marketing videos are served as MP4 assets with the frontend. File-storage architecture must be reviewed by actual data type rather than assumed to contain patient records.</w:t>
+      </w:r>
+    </w:p>
+    <w:p>
+      <w:pPr>
+        <w:pStyle w:val="Normal"/>
+      </w:pPr>
+      <w:r>
+        <w:t xml:space="preserve">- Agreement PDFs: PDFKit. Electronic-signature consent, versioning and audit records are implemented by the application; there is no assumed DocuSign contract or certification.</w:t>
+      </w:r>
+    </w:p>
+    <w:p>
+      <w:pPr>
+        <w:pStyle w:val="Normal"/>
+      </w:pPr>
+      <w:r>
+        <w:t xml:space="preserve">- Workspace/build/hosting: Replit environment, a pnpm monorepo, TypeScript builds and Vite; test tooling includes Vitest and React Testing Library. Build/test tools are not automatically patient-data processors.</w:t>
+      </w:r>
+    </w:p>
+    <w:p>
+      <w:pPr>
+        <w:pStyle w:val="Normal"/>
+      </w:pPr>
+      <w:r>
+        <w:t xml:space="preserve">- Optional connections: GoHighLevel webhooks, Zapier/Make or another compatible customer-configured connector for structured lead intake. These are not guaranteed native integrations with every CRM/EHR.</w:t>
+      </w:r>
+    </w:p>
+    <w:p>
+      <w:pPr>
+        <w:pStyle w:val="Normal"/>
+      </w:pPr>
+      <w:r>
+        <w:t xml:space="preserve">- Proposed only: Twilio browser calling. No integrated telephony or AI-provider service is promised in the present agreement scope.</w:t>
+      </w:r>
+    </w:p>
+    <w:p>
+      <w:pPr>
+        <w:pStyle w:val="Normal"/>
+      </w:pPr>
+      <w:r>
+        <w:t xml:space="preserve">Have the technical team map which vendors receive which categories of data and verify actual production deployment, regions, service plans and contracts. This list does not establish vendor HIPAA eligibility, BAAs, security certifications, data residency or ongoing software-version commitments.</w:t>
+      </w:r>
+    </w:p>
+    <w:p>
+      <w:pPr>
+        <w:pStyle w:val="Heading1"/>
+      </w:pPr>
+      <w:r>
         <w:t xml:space="preserve">3. Identify the correct contracting parties</w:t>
       </w:r>
     </w:p>
@@ -143,7 +479,7 @@
         <w:pStyle w:val="Normal"/>
       </w:pPr>
       <w:r>
-        <w:t xml:space="preserve">Confirm the owner's legal entity name, entity type, state of formation, business address, authorized signatory, and legal-notice contact. Patient Pipeline is the customer-facing brand; the current template identifies the company as Reactivation Power. Neither label should be assumed to establish the legal entity or a registered DBA.</w:t>
+        <w:t xml:space="preserve">Confirmed by the owner: Beyond Healthcare LLC owns and operates Patient Pipeline. Patient Pipeline is the product/customer-facing brand; do not substitute Reactivation Power as the legal company. The template's company identity and product branding have been corrected for new agreements. Confirm the LLC's state of formation, business address, authorized signatory, and legal-notice contact. Do not assume Patient Pipeline is a registered DBA.</w:t>
       </w:r>
     </w:p>
     <w:p>
@@ -215,7 +551,7 @@
         <w:pStyle w:val="Normal"/>
       </w:pPr>
       <w:r>
-        <w:t xml:space="preserve">- Written notice in the template: 30 days.</w:t>
+        <w:t xml:space="preserve">- Separate advance cancellation notice in the updated default template: none (0 days); cancellation takes effect at the applicable term/billing-period end.</w:t>
       </w:r>
     </w:p>
     <w:p>
@@ -271,15 +607,15 @@
         <w:pStyle w:val="Normal"/>
       </w:pPr>
       <w:r>
-        <w:t xml:space="preserve">The current template describes a fixed initial term followed by month-to-month renewal, with written notice. It says no early cancellation without mutual agreement and continued responsibility for term fees. Counsel must assess and approve those provisions, required renewal disclosures/reminders, cancellation methods, and any applicable state subscription rules.</w:t>
-      </w:r>
-    </w:p>
-    <w:p>
-      <w:pPr>
-        <w:pStyle w:val="Normal"/>
-      </w:pPr>
-      <w:r>
-        <w:t xml:space="preserve">The customer portal currently allows the owner to request cancellation, acknowledges remaining payments, and schedules it for the contractual term end. After the fixed term, it schedules cancellation at the end of the current billing period. That implementation does not itself establish enforcement of the template's 30-day notice requirement. Reconcile the written policy and the software.</w:t>
+        <w:t xml:space="preserve">The updated default template describes a fixed initial term followed by month-to-month renewal. Customer portal cancellation counts as notice, without an additional advance-notice window or required cancellation letter. During the fixed term, cancellation is scheduled for the term end and remaining installments stay due; early termination requires mutual written agreement except as required by law. During month-to-month renewal, cancellation is effective at the current billing-period end. Counsel must draft the new agreement's rules and assess enforceability, required renewal disclosures/reminders, cancellation methods, and applicable state subscription rules.</w:t>
+      </w:r>
+    </w:p>
+    <w:p>
+      <w:pPr>
+        <w:pStyle w:val="Normal"/>
+      </w:pPr>
+      <w:r>
+        <w:t xml:space="preserve">The portal already uses those effective dates and asks the owner to acknowledge remaining payments. The standard template and zero-day summary have now been aligned with that implementation; prices, initial term lengths and Stripe cancellation behavior were not changed. Previously signed or individually customized agreements were not rewritten and may contain different terms. Counsel should address any transition or legacy obligations explicitly; a software-template change does not amend an existing contract.</w:t>
       </w:r>
     </w:p>
     <w:p>
@@ -399,7 +735,7 @@
         <w:pStyle w:val="Normal"/>
       </w:pPr>
       <w:r>
-        <w:t xml:space="preserve">The old template restricts use to contacts with an existing customer relationship. That would conflict with the new-lead product; revise the service and acceptable-use provisions while retaining lawful-contact requirements.</w:t>
+        <w:t xml:space="preserve">The updated standard template now covers both past-patient reactivation and lawful new-inquiry follow-up, rather than restricting all contacts to an existing customer relationship. Counsel should independently draft appropriate consent, permitted-use and responsibility provisions for the new agreement.</w:t>
       </w:r>
     </w:p>
     <w:p>
@@ -543,7 +879,7 @@
         <w:pStyle w:val="Normal"/>
       </w:pPr>
       <w:r>
-        <w:t xml:space="preserve">- Current template (attached as Appendix A), representative blank checkout/signing screens, payment flow, and customer-facing sales promises.</w:t>
+        <w:t xml:space="preserve">- Representative blank checkout/signing screens, payment flow, and customer-facing sales promises. The existing internal template can be supplied separately as reference, but is not a proposed contract or included as the lawyer's drafting starting point here.</w:t>
       </w:r>
     </w:p>
     <w:p>
@@ -592,215 +928,6 @@
       </w:pPr>
       <w:r>
         <w:t xml:space="preserve">Approve the legal text and any required implementation changes together before sending the new agreement to customers. This brief does not alter any live agreement, billing terms, or customer records.</w:t>
-      </w:r>
-    </w:p>
-    <w:p>
-      <w:pPr>
-        <w:pStyle w:val="Heading1"/>
-        <w:pageBreakBefore/>
-      </w:pPr>
-      <w:r>
-        <w:t xml:space="preserve">Appendix A: Existing template for counsel to review</w:t>
-      </w:r>
-    </w:p>
-    <w:p>
-      <w:pPr>
-        <w:pStyle w:val="Normal"/>
-      </w:pPr>
-      <w:r>
-        <w:t xml:space="preserve">The following is the current default agreement text from the app, with unresolved merge fields preserved. It is an existing implementation artifact, NOT counsel-approved final language. Individual stored agreements may contain different terms. The text contains legacy branding and scope issues identified above.</w:t>
-      </w:r>
-    </w:p>
-    <w:p>
-      <w:pPr>
-        <w:pStyle w:val="Heading1"/>
-      </w:pPr>
-      <w:r>
-        <w:t xml:space="preserve">Parties and Services</w:t>
-      </w:r>
-    </w:p>
-    <w:p>
-      <w:pPr>
-        <w:pStyle w:val="Heading1"/>
-      </w:pPr>
-      <w:r>
-        <w:t xml:space="preserve">This Service Agreement (the "Agreement") is between {{company_name}} ("Company", "we", "us") and {{business_name}}, located at {{business_address}} ("Customer", "you"), represented by {{full_name}}. The business owner of record is {{owner_name}} ({{owner_phone}}). Notices to Customer may be sent to {{email}} or {{phone}}.</w:t>
-      </w:r>
-    </w:p>
-    <w:p>
-      <w:pPr>
-        <w:pStyle w:val="Normal"/>
-      </w:pPr>
-      <w:r>
-        <w:t xml:space="preserve">Company will provide Customer with access to the Reactivation Power platform, which includes the reactivation call training courses, the call scripts, the reactivation dialer and contact pipeline, and reporting for Customer's team (the "Services"). Access is granted to the Customer's owner account and up to five staff accounts for use within Customer's own business only.</w:t>
-      </w:r>
-    </w:p>
-    <w:p>
-      <w:pPr>
-        <w:pStyle w:val="Heading1"/>
-      </w:pPr>
-      <w:r>
-        <w:t xml:space="preserve">Term of Agreement [initials]</w:t>
-      </w:r>
-    </w:p>
-    <w:p>
-      <w:pPr>
-        <w:pStyle w:val="Heading1"/>
-      </w:pPr>
-      <w:r>
-        <w:t xml:space="preserve">The initial term of this Agreement is {{term_months}} months (the "Term"). The Term begins on the Start Date, which is {{trial_days}} days after the setup fee is paid, and ends {{term_months}} months later (the "End Date"). Based on today's date, the estimated Start Date is {{start_date}} and the estimated End Date is {{end_date}}; the actual dates are fixed by the date the setup fee is charged.</w:t>
-      </w:r>
-    </w:p>
-    <w:p>
-      <w:pPr>
-        <w:pStyle w:val="Normal"/>
-      </w:pPr>
-      <w:r>
-        <w:t xml:space="preserve">Access to the Services begins as soon as the setup fee has been paid and this Agreement has been signed, so the {{trial_days}} days before the Start Date are included at no additional charge.</w:t>
-      </w:r>
-    </w:p>
-    <w:p>
-      <w:pPr>
-        <w:pStyle w:val="Heading1"/>
-      </w:pPr>
-      <w:r>
-        <w:t xml:space="preserve">Fees and Billing [initials]</w:t>
-      </w:r>
-    </w:p>
-    <w:p>
-      <w:pPr>
-        <w:pStyle w:val="Heading1"/>
-      </w:pPr>
-      <w:r>
-        <w:t xml:space="preserve">Customer agrees to pay a one-time setup fee of {{setup_fee}}, charged when this Agreement is signed, and a recurring monthly fee of {{monthly_amount}} for the Services. The first monthly fee is charged on the Start Date and on the same day of each month thereafter for the remainder of the Term. All amounts are in U.S. dollars. Fees are not refundable except as required by law.</w:t>
-      </w:r>
-    </w:p>
-    <w:p>
-      <w:pPr>
-        <w:pStyle w:val="Normal"/>
-      </w:pPr>
-      <w:r>
-        <w:t xml:space="preserve">If a monthly payment cannot be collected, Company may retry the charge, charge the backup card on file, and suspend access to the Services until the balance is paid. Customer remains responsible for all fees for the full Term.</w:t>
-      </w:r>
-    </w:p>
-    <w:p>
-      <w:pPr>
-        <w:pStyle w:val="Heading1"/>
-      </w:pPr>
-      <w:r>
-        <w:t xml:space="preserve">Payment Authorization and Cards on File [initials]</w:t>
-      </w:r>
-    </w:p>
-    <w:p>
-      <w:pPr>
-        <w:pStyle w:val="Heading1"/>
-      </w:pPr>
-      <w:r>
-        <w:t xml:space="preserve">Customer authorizes Company to keep two payment cards on file with its payment processor (Stripe) and to charge the primary card for every amount due under this Agreement. If a charge to the primary card fails, Customer authorizes Company to charge the backup card for the same amount. Customer agrees to keep at least one valid card on file for the whole Term and to update card details promptly when they change.</w:t>
-      </w:r>
-    </w:p>
-    <w:p>
-      <w:pPr>
-        <w:pStyle w:val="Normal"/>
-      </w:pPr>
-      <w:r>
-        <w:t xml:space="preserve">Card details are entered directly into Stripe and are never stored on Company's systems.</w:t>
-      </w:r>
-    </w:p>
-    <w:p>
-      <w:pPr>
-        <w:pStyle w:val="Heading1"/>
-      </w:pPr>
-      <w:r>
-        <w:t xml:space="preserve">Cancellation and Notice [initials]</w:t>
-      </w:r>
-    </w:p>
-    <w:p>
-      <w:pPr>
-        <w:pStyle w:val="Heading1"/>
-      </w:pPr>
-      <w:r>
-        <w:t xml:space="preserve">This Agreement may not be cancelled before the End Date except by written agreement of both parties. Either party may end this Agreement at the End Date by giving written notice at least {{notice_days}} days before the End Date. If neither party gives notice, this Agreement continues month to month at the then-current monthly fee until either party gives {{notice_days}} days' written notice.</w:t>
-      </w:r>
-    </w:p>
-    <w:p>
-      <w:pPr>
-        <w:pStyle w:val="Normal"/>
-      </w:pPr>
-      <w:r>
-        <w:t xml:space="preserve">Company may end this Agreement immediately if Customer misuses the Services, shares access outside its own business, or fails to pay an amount due within thirty (30) days of a written reminder.</w:t>
-      </w:r>
-    </w:p>
-    <w:p>
-      <w:pPr>
-        <w:pStyle w:val="Heading1"/>
-      </w:pPr>
-      <w:r>
-        <w:t xml:space="preserve">Customer Responsibilities</w:t>
-      </w:r>
-    </w:p>
-    <w:p>
-      <w:pPr>
-        <w:pStyle w:val="Heading1"/>
-      </w:pPr>
-      <w:r>
-        <w:t xml:space="preserve">Customer is responsible for the accuracy of the contact lists it uploads and for complying with all laws that apply to contacting its own past customers or patients, including telemarketing, privacy and health-information rules. Customer will use the Services only to contact people who have an existing relationship with Customer's business.</w:t>
-      </w:r>
-    </w:p>
-    <w:p>
-      <w:pPr>
-        <w:pStyle w:val="Normal"/>
-      </w:pPr>
-      <w:r>
-        <w:t xml:space="preserve">Customer will keep login details confidential, will not share accounts between people, and will let Company know promptly if it believes an account has been compromised.</w:t>
-      </w:r>
-    </w:p>
-    <w:p>
-      <w:pPr>
-        <w:pStyle w:val="Heading1"/>
-      </w:pPr>
-      <w:r>
-        <w:t xml:space="preserve">Intellectual Property and Confidentiality</w:t>
-      </w:r>
-    </w:p>
-    <w:p>
-      <w:pPr>
-        <w:pStyle w:val="Heading1"/>
-      </w:pPr>
-      <w:r>
-        <w:t xml:space="preserve">The Services, training content, scripts and software remain the property of Company. Customer receives a limited, non-transferable licence to use them for its own business during the Term and may not copy, resell, record or distribute them. Customer's contact data remains Customer's property; Company uses it only to provide the Services and keeps it confidential.</w:t>
-      </w:r>
-    </w:p>
-    <w:p>
-      <w:pPr>
-        <w:pStyle w:val="Heading1"/>
-      </w:pPr>
-      <w:r>
-        <w:t xml:space="preserve">Disclaimer and Limitation of Liability [initials]</w:t>
-      </w:r>
-    </w:p>
-    <w:p>
-      <w:pPr>
-        <w:pStyle w:val="Heading1"/>
-      </w:pPr>
-      <w:r>
-        <w:t xml:space="preserve">Company provides training and tools; results depend on how Customer's team uses them. Company does not guarantee any number of appointments, reactivated customers or revenue. To the fullest extent permitted by law, the Services are provided "as is", and Company's total liability under this Agreement is limited to the fees Customer paid in the three (3) months before the claim arose. Neither party is liable for indirect or consequential damages.</w:t>
-      </w:r>
-    </w:p>
-    <w:p>
-      <w:pPr>
-        <w:pStyle w:val="Heading1"/>
-      </w:pPr>
-      <w:r>
-        <w:t xml:space="preserve">Electronic Signature and Entire Agreement</w:t>
-      </w:r>
-    </w:p>
-    <w:p>
-      <w:pPr>
-        <w:pStyle w:val="Heading1"/>
-      </w:pPr>
-      <w:r>
-        <w:t xml:space="preserve">Customer agrees that signing this Agreement electronically, including by typing or drawing a signature and initialing sections, has the same effect as a handwritten signature, and that Company may keep this Agreement and its record of completion electronically. This Agreement, together with the amounts shown above, is the entire agreement between the parties about the Services and replaces any earlier discussions. It may only be changed in writing signed by both parties. Signed on {{agreement_date}}.</w:t>
       </w:r>
     </w:p>
     <w:sectPr>

</xml_diff>